<commit_message>
Alinha Anexo I à proposta (data e custos de nuvem)
Co-Authored-By: Claude Opus 5.5 <noreply@anthropic.com>
Claude-Session: https://claude.ai/code/session_01W9k6rtJ9YG3B4ZzgCkiDqC
</commit_message>
<xml_diff>
--- a/docs/entregaveis/Observatorio_FBA_Anexo_I_Requisitos_NatGED.docx
+++ b/docs/entregaveis/Observatorio_FBA_Anexo_I_Requisitos_NatGED.docx
@@ -343,7 +343,7 @@
               <w:jc w:val="left"/>
             </w:pPr>
             <w:r>
-              <w:t xml:space="preserve">24/09/2026</w:t>
+              <w:t xml:space="preserve">25/09/2026</w:t>
             </w:r>
           </w:p>
         </w:tc>
@@ -17204,7 +17204,7 @@
         <w:pStyle w:val="FirstParagraph"/>
       </w:pPr>
       <w:r>
-        <w:t xml:space="preserve">Estimativa a confirmar na proposta comercial (valores mensais aproximados, câmbio a definir):</w:t>
+        <w:t xml:space="preserve">Valores mensais estimados. Os serviços de nuvem estão incluídos no item 18 da proposta comercial (Hospedagem cloud, R$ 1.300,00/mês), sujeito à revisão cambial prevista nas condições comerciais.</w:t>
       </w:r>
     </w:p>
     <w:tbl>
@@ -17215,11 +17215,11 @@
         <w:jc w:val="start"/>
       </w:tblPr>
       <w:tblGrid>
-        <w:gridCol w:w="1446"/>
-        <w:gridCol w:w="1827"/>
-        <w:gridCol w:w="685"/>
-        <w:gridCol w:w="837"/>
-        <w:gridCol w:w="3122"/>
+        <w:gridCol w:w="2768"/>
+        <w:gridCol w:w="1460"/>
+        <w:gridCol w:w="615"/>
+        <w:gridCol w:w="768"/>
+        <w:gridCol w:w="2306"/>
       </w:tblGrid>
       <w:tr>
         <w:trPr>
@@ -17295,19 +17295,19 @@
               <w:jc w:val="left"/>
             </w:pPr>
             <w:r>
-              <w:t xml:space="preserve">Computação (app + worker)</w:t>
-            </w:r>
-          </w:p>
-        </w:tc>
-        <w:tc>
-          <w:tcPr/>
-          <w:p>
-            <w:pPr>
-              <w:pStyle w:val="Compact"/>
-              <w:jc w:val="left"/>
-            </w:pPr>
-            <w:r>
-              <w:t xml:space="preserve">AWS (ECS/Lightsail) ou equivalente</w:t>
+              <w:t xml:space="preserve">Computação (app + worker), banco PostgreSQL gerenciado, Redis, storage de objetos, balanceador</w:t>
+            </w:r>
+          </w:p>
+        </w:tc>
+        <w:tc>
+          <w:tcPr/>
+          <w:p>
+            <w:pPr>
+              <w:pStyle w:val="Compact"/>
+              <w:jc w:val="left"/>
+            </w:pPr>
+            <w:r>
+              <w:t xml:space="preserve">AWS (região São Paulo) ou equivalente</w:t>
             </w:r>
           </w:p>
         </w:tc>
@@ -17331,45 +17331,45 @@
               <w:jc w:val="left"/>
             </w:pPr>
             <w:r>
-              <w:t xml:space="preserve">a cotar</w:t>
-            </w:r>
-          </w:p>
-        </w:tc>
-        <w:tc>
-          <w:tcPr/>
-          <w:p>
-            <w:pPr>
-              <w:pStyle w:val="Compact"/>
-              <w:jc w:val="left"/>
-            </w:pPr>
-            <w:r>
-              <w:t xml:space="preserve">Produção + homologação</w:t>
-            </w:r>
-          </w:p>
-        </w:tc>
-      </w:tr>
-      <w:tr>
-        <w:tc>
-          <w:tcPr/>
-          <w:p>
-            <w:pPr>
-              <w:pStyle w:val="Compact"/>
-              <w:jc w:val="left"/>
-            </w:pPr>
-            <w:r>
-              <w:t xml:space="preserve">Banco PostgreSQL gerenciado</w:t>
-            </w:r>
-          </w:p>
-        </w:tc>
-        <w:tc>
-          <w:tcPr/>
-          <w:p>
-            <w:pPr>
-              <w:pStyle w:val="Compact"/>
-              <w:jc w:val="left"/>
-            </w:pPr>
-            <w:r>
-              <w:t xml:space="preserve">AWS RDS</w:t>
+              <w:t xml:space="preserve">até R$ 1.100,00/mês</w:t>
+            </w:r>
+          </w:p>
+        </w:tc>
+        <w:tc>
+          <w:tcPr/>
+          <w:p>
+            <w:pPr>
+              <w:pStyle w:val="Compact"/>
+              <w:jc w:val="left"/>
+            </w:pPr>
+            <w:r>
+              <w:t xml:space="preserve">Produção + homologação; banco com backup automatizado</w:t>
+            </w:r>
+          </w:p>
+        </w:tc>
+      </w:tr>
+      <w:tr>
+        <w:tc>
+          <w:tcPr/>
+          <w:p>
+            <w:pPr>
+              <w:pStyle w:val="Compact"/>
+              <w:jc w:val="left"/>
+            </w:pPr>
+            <w:r>
+              <w:t xml:space="preserve">CDN / WAF</w:t>
+            </w:r>
+          </w:p>
+        </w:tc>
+        <w:tc>
+          <w:tcPr/>
+          <w:p>
+            <w:pPr>
+              <w:pStyle w:val="Compact"/>
+              <w:jc w:val="left"/>
+            </w:pPr>
+            <w:r>
+              <w:t xml:space="preserve">Cloudflare (plano gratuito/Pro)</w:t>
             </w:r>
           </w:p>
         </w:tc>
@@ -17393,45 +17393,45 @@
               <w:jc w:val="left"/>
             </w:pPr>
             <w:r>
-              <w:t xml:space="preserve">a cotar</w:t>
-            </w:r>
-          </w:p>
-        </w:tc>
-        <w:tc>
-          <w:tcPr/>
-          <w:p>
-            <w:pPr>
-              <w:pStyle w:val="Compact"/>
-              <w:jc w:val="left"/>
-            </w:pPr>
-            <w:r>
-              <w:t xml:space="preserve">Com backup automatizado</w:t>
-            </w:r>
-          </w:p>
-        </w:tc>
-      </w:tr>
-      <w:tr>
-        <w:tc>
-          <w:tcPr/>
-          <w:p>
-            <w:pPr>
-              <w:pStyle w:val="Compact"/>
-              <w:jc w:val="left"/>
-            </w:pPr>
-            <w:r>
-              <w:t xml:space="preserve">Storage de objetos + backup</w:t>
-            </w:r>
-          </w:p>
-        </w:tc>
-        <w:tc>
-          <w:tcPr/>
-          <w:p>
-            <w:pPr>
-              <w:pStyle w:val="Compact"/>
-              <w:jc w:val="left"/>
-            </w:pPr>
-            <w:r>
-              <w:t xml:space="preserve">AWS S3</w:t>
+              <w:t xml:space="preserve">até R$ 120,00/mês</w:t>
+            </w:r>
+          </w:p>
+        </w:tc>
+        <w:tc>
+          <w:tcPr/>
+          <w:p>
+            <w:pPr>
+              <w:pStyle w:val="Compact"/>
+              <w:jc w:val="left"/>
+            </w:pPr>
+            <w:r>
+              <w:t xml:space="preserve">—</w:t>
+            </w:r>
+          </w:p>
+        </w:tc>
+      </w:tr>
+      <w:tr>
+        <w:tc>
+          <w:tcPr/>
+          <w:p>
+            <w:pPr>
+              <w:pStyle w:val="Compact"/>
+              <w:jc w:val="left"/>
+            </w:pPr>
+            <w:r>
+              <w:t xml:space="preserve">E-mail transacional</w:t>
+            </w:r>
+          </w:p>
+        </w:tc>
+        <w:tc>
+          <w:tcPr/>
+          <w:p>
+            <w:pPr>
+              <w:pStyle w:val="Compact"/>
+              <w:jc w:val="left"/>
+            </w:pPr>
+            <w:r>
+              <w:t xml:space="preserve">Amazon SES / Brevo</w:t>
             </w:r>
           </w:p>
         </w:tc>
@@ -17455,131 +17455,7 @@
               <w:jc w:val="left"/>
             </w:pPr>
             <w:r>
-              <w:t xml:space="preserve">baixo (≥ 10 GB)</w:t>
-            </w:r>
-          </w:p>
-        </w:tc>
-        <w:tc>
-          <w:tcPr/>
-          <w:p>
-            <w:pPr>
-              <w:pStyle w:val="Compact"/>
-              <w:jc w:val="left"/>
-            </w:pPr>
-            <w:r>
-              <w:t xml:space="preserve">—</w:t>
-            </w:r>
-          </w:p>
-        </w:tc>
-      </w:tr>
-      <w:tr>
-        <w:tc>
-          <w:tcPr/>
-          <w:p>
-            <w:pPr>
-              <w:pStyle w:val="Compact"/>
-              <w:jc w:val="left"/>
-            </w:pPr>
-            <w:r>
-              <w:t xml:space="preserve">CDN / WAF</w:t>
-            </w:r>
-          </w:p>
-        </w:tc>
-        <w:tc>
-          <w:tcPr/>
-          <w:p>
-            <w:pPr>
-              <w:pStyle w:val="Compact"/>
-              <w:jc w:val="left"/>
-            </w:pPr>
-            <w:r>
-              <w:t xml:space="preserve">Cloudflare (plano gratuito/Pro)</w:t>
-            </w:r>
-          </w:p>
-        </w:tc>
-        <w:tc>
-          <w:tcPr/>
-          <w:p>
-            <w:pPr>
-              <w:pStyle w:val="Compact"/>
-              <w:jc w:val="left"/>
-            </w:pPr>
-            <w:r>
-              <w:t xml:space="preserve">Nuvem</w:t>
-            </w:r>
-          </w:p>
-        </w:tc>
-        <w:tc>
-          <w:tcPr/>
-          <w:p>
-            <w:pPr>
-              <w:pStyle w:val="Compact"/>
-              <w:jc w:val="left"/>
-            </w:pPr>
-            <w:r>
-              <w:t xml:space="preserve">R$ 0 – baixo</w:t>
-            </w:r>
-          </w:p>
-        </w:tc>
-        <w:tc>
-          <w:tcPr/>
-          <w:p>
-            <w:pPr>
-              <w:pStyle w:val="Compact"/>
-              <w:jc w:val="left"/>
-            </w:pPr>
-            <w:r>
-              <w:t xml:space="preserve">—</w:t>
-            </w:r>
-          </w:p>
-        </w:tc>
-      </w:tr>
-      <w:tr>
-        <w:tc>
-          <w:tcPr/>
-          <w:p>
-            <w:pPr>
-              <w:pStyle w:val="Compact"/>
-              <w:jc w:val="left"/>
-            </w:pPr>
-            <w:r>
-              <w:t xml:space="preserve">E-mail transacional</w:t>
-            </w:r>
-          </w:p>
-        </w:tc>
-        <w:tc>
-          <w:tcPr/>
-          <w:p>
-            <w:pPr>
-              <w:pStyle w:val="Compact"/>
-              <w:jc w:val="left"/>
-            </w:pPr>
-            <w:r>
-              <w:t xml:space="preserve">Amazon SES / Brevo</w:t>
-            </w:r>
-          </w:p>
-        </w:tc>
-        <w:tc>
-          <w:tcPr/>
-          <w:p>
-            <w:pPr>
-              <w:pStyle w:val="Compact"/>
-              <w:jc w:val="left"/>
-            </w:pPr>
-            <w:r>
-              <w:t xml:space="preserve">Nuvem</w:t>
-            </w:r>
-          </w:p>
-        </w:tc>
-        <w:tc>
-          <w:tcPr/>
-          <w:p>
-            <w:pPr>
-              <w:pStyle w:val="Compact"/>
-              <w:jc w:val="left"/>
-            </w:pPr>
-            <w:r>
-              <w:t xml:space="preserve">baixo</w:t>
+              <w:t xml:space="preserve">até R$ 80,00/mês</w:t>
             </w:r>
           </w:p>
         </w:tc>
@@ -17741,7 +17617,7 @@
               <w:jc w:val="left"/>
             </w:pPr>
             <w:r>
-              <w:t xml:space="preserve">Sentry (plano gratuito/Team)</w:t>
+              <w:t xml:space="preserve">Sentry (plano gratuito)</w:t>
             </w:r>
           </w:p>
         </w:tc>
@@ -17765,19 +17641,19 @@
               <w:jc w:val="left"/>
             </w:pPr>
             <w:r>
-              <w:t xml:space="preserve">R$ 0 – baixo</w:t>
-            </w:r>
-          </w:p>
-        </w:tc>
-        <w:tc>
-          <w:tcPr/>
-          <w:p>
-            <w:pPr>
-              <w:pStyle w:val="Compact"/>
-              <w:jc w:val="left"/>
-            </w:pPr>
-            <w:r>
-              <w:t xml:space="preserve">—</w:t>
+              <w:t xml:space="preserve">R$ 0</w:t>
+            </w:r>
+          </w:p>
+        </w:tc>
+        <w:tc>
+          <w:tcPr/>
+          <w:p>
+            <w:pPr>
+              <w:pStyle w:val="Compact"/>
+              <w:jc w:val="left"/>
+            </w:pPr>
+            <w:r>
+              <w:t xml:space="preserve">Incluído no item 19 (Backup e segurança)</w:t>
             </w:r>
           </w:p>
         </w:tc>

</xml_diff>